<commit_message>
Rohini Acceptance criteria document
</commit_message>
<xml_diff>
--- a/Rohini_AcceptanceCriteria_Doc.docx
+++ b/Rohini_AcceptanceCriteria_Doc.docx
@@ -933,6 +933,9 @@
     </w:p>
     <w:p>
       <w:pPr>
+        <w:tabs>
+          <w:tab w:val="left" w:pos="1155"/>
+        </w:tabs>
         <w:spacing w:after="0" w:line="240" w:lineRule="auto"/>
         <w:rPr>
           <w:rFonts w:ascii="Verdana" w:eastAsia="Times New Roman" w:hAnsi="Verdana" w:cs="Times New Roman"/>
@@ -941,6 +944,15 @@
           <w:lang w:eastAsia="en-IN"/>
         </w:rPr>
       </w:pPr>
+      <w:r>
+        <w:rPr>
+          <w:rFonts w:ascii="Verdana" w:eastAsia="Times New Roman" w:hAnsi="Verdana" w:cs="Times New Roman"/>
+          <w:sz w:val="24"/>
+          <w:szCs w:val="24"/>
+          <w:lang w:eastAsia="en-IN"/>
+        </w:rPr>
+        <w:tab/>
+      </w:r>
     </w:p>
     <w:p>
       <w:pPr>
@@ -1347,14 +1359,26 @@
     </w:p>
     <w:p>
       <w:pPr>
-        <w:spacing w:before="100" w:beforeAutospacing="1" w:after="100" w:afterAutospacing="1" w:line="240" w:lineRule="auto"/>
-        <w:rPr>
-          <w:rFonts w:ascii="Verdana" w:eastAsia="Times New Roman" w:hAnsi="Verdana" w:cs="Times New Roman"/>
-          <w:sz w:val="24"/>
-          <w:szCs w:val="24"/>
-          <w:lang w:eastAsia="en-IN"/>
-        </w:rPr>
-      </w:pPr>
+        <w:tabs>
+          <w:tab w:val="left" w:pos="4755"/>
+        </w:tabs>
+        <w:spacing w:before="100" w:beforeAutospacing="1" w:after="100" w:afterAutospacing="1" w:line="240" w:lineRule="auto"/>
+        <w:rPr>
+          <w:rFonts w:ascii="Verdana" w:eastAsia="Times New Roman" w:hAnsi="Verdana" w:cs="Times New Roman"/>
+          <w:sz w:val="24"/>
+          <w:szCs w:val="24"/>
+          <w:lang w:eastAsia="en-IN"/>
+        </w:rPr>
+      </w:pPr>
+      <w:r>
+        <w:rPr>
+          <w:rFonts w:ascii="Verdana" w:eastAsia="Times New Roman" w:hAnsi="Verdana" w:cs="Times New Roman"/>
+          <w:sz w:val="24"/>
+          <w:szCs w:val="24"/>
+          <w:lang w:eastAsia="en-IN"/>
+        </w:rPr>
+        <w:tab/>
+      </w:r>
     </w:p>
     <w:p>
       <w:pPr>
@@ -2164,6 +2188,7 @@
         </w:rPr>
         <w:tab/>
       </w:r>
+      <w:bookmarkStart w:id="0" w:name="_GoBack"/>
       <w:r>
         <w:rPr>
           <w:rFonts w:ascii="Verdana" w:eastAsia="Times New Roman" w:hAnsi="Verdana" w:cs="Times New Roman"/>
@@ -2348,9 +2373,8 @@
           <w:lang w:eastAsia="en-IN"/>
         </w:rPr>
       </w:pPr>
-      <w:bookmarkStart w:id="0" w:name="_GoBack"/>
-      <w:bookmarkEnd w:id="0"/>
-    </w:p>
+    </w:p>
+    <w:bookmarkEnd w:id="0"/>
     <w:p>
       <w:pPr>
         <w:rPr>

</xml_diff>